<commit_message>
BOM: volumen total por renglón y litros normales del gas
La columna de volumen mostraba el de una unidad (1 kg de N₂ = 800,5 L normales) al lado de cantidades de
gramos. Ahora es el volumen de la cantidad del renglón, igual que la masa total: 3,76 L normales de N₂ en el
ABC 1 kg y 0,045 L para 50 g de polvo. El gas lleva «(L normales)» en el nombre. El Word explica la columna.

Co-Authored-By: Claude Opus 5.5 <noreply@anthropic.com>
Claude-Session: https://claude.ai/code/session_01E33CYXtZ2f33D1RjoRdR65
</commit_message>
<xml_diff>
--- a/salida/justificacion/Justificacion del BOM.docx
+++ b/salida/justificacion/Justificacion del BOM.docx
@@ -755,7 +755,7 @@
           <w:sz w:val="16"/>
           <w:szCs w:val="16"/>
         </w:rPr>
-        <w:t xml:space="preserve">Cada renglón tiene la cantidad en su propia unidad (UM) y, cuando corresponde, la densidad, el volumen y la masa. La masa de un producto o subconjunto es la suma de la masa total de los renglones que tiene debajo; las piezas compradas sin masa declarada (manómetro, tornillos, internos de válvula) no suman.</w:t>
+        <w:t xml:space="preserve">Cada renglón tiene la cantidad en su propia unidad (UM) y, cuando corresponde, la densidad, el volumen total y la masa. El volumen y la masa total son los de la cantidad del renglón; la masa unitaria es la de una unidad (1 u, 1 kg o 1 L). La masa de un producto o subconjunto es la suma de la masa total de los renglones que tiene debajo; las piezas compradas sin masa declarada (manómetro, tornillos, internos de válvula) no suman.</w:t>
       </w:r>
     </w:p>
     <w:tbl>
@@ -918,7 +918,7 @@
                 <w:sz w:val="14"/>
                 <w:szCs w:val="14"/>
               </w:rPr>
-              <w:t xml:space="preserve">Volumen (L)</w:t>
+              <w:t xml:space="preserve">Volumen total (L)</w:t>
             </w:r>
           </w:p>
         </w:tc>
@@ -1090,7 +1090,7 @@
                 <w:sz w:val="14"/>
                 <w:szCs w:val="14"/>
               </w:rPr>
-              <w:t xml:space="preserve">Volumen del sólido = masa ÷ densidad</w:t>
+              <w:t xml:space="preserve">Volumen del sólido (masa ÷ densidad) × cantidad</w:t>
             </w:r>
           </w:p>
         </w:tc>
@@ -1260,7 +1260,7 @@
                 <w:sz w:val="14"/>
                 <w:szCs w:val="14"/>
               </w:rPr>
-              <w:t xml:space="preserve">Lo que ocupa: masa ÷ densidad</w:t>
+              <w:t xml:space="preserve">Lo que ocupa la carga: masa ÷ densidad</w:t>
             </w:r>
           </w:p>
         </w:tc>
@@ -1430,7 +1430,7 @@
                 <w:sz w:val="14"/>
                 <w:szCs w:val="14"/>
               </w:rPr>
-              <w:t xml:space="preserve">1 L por litro</w:t>
+              <w:t xml:space="preserve">Los litros de carga</w:t>
             </w:r>
           </w:p>
         </w:tc>
@@ -1600,7 +1600,7 @@
                 <w:sz w:val="14"/>
                 <w:szCs w:val="14"/>
               </w:rPr>
-              <w:t xml:space="preserve">Capacidad del cilindro por kg</w:t>
+              <w:t xml:space="preserve">Capacidad del cilindro: carga ÷ relación de llenado</w:t>
             </w:r>
           </w:p>
         </w:tc>
@@ -1770,7 +1770,7 @@
                 <w:sz w:val="14"/>
                 <w:szCs w:val="14"/>
               </w:rPr>
-              <w:t xml:space="preserve">Litros normales por kg</w:t>
+              <w:t xml:space="preserve">Litros normales de la carga (lo que ocuparía el gas a 0 °C y 1 atm)</w:t>
             </w:r>
           </w:p>
         </w:tc>

</xml_diff>